<commit_message>
feat: Wazir Real-Time Deadline Tracker with Supabase Live Sync and Kanban Matrix
</commit_message>
<xml_diff>
--- a/MoM/MoM August 14 .docx
+++ b/MoM/MoM August 14 .docx
@@ -1800,7 +1800,19 @@
         <w:rPr>
           <w:lang w:val="en-US"/>
         </w:rPr>
-        <w:t>Main POC</w:t>
+        <w:t>Mai</w:t>
+      </w:r>
+      <w:r>
+        <w:rPr>
+          <w:lang w:val="en-US"/>
+        </w:rPr>
+        <w:t>l</w:t>
+      </w:r>
+      <w:r>
+        <w:rPr>
+          <w:lang w:val="en-US"/>
+        </w:rPr>
+        <w:t xml:space="preserve"> POC</w:t>
       </w:r>
     </w:p>
     <w:p>
@@ -3027,6 +3039,1449 @@
           <w:lang w:val="en-US"/>
         </w:rPr>
       </w:pPr>
+      <w:r>
+        <w:rPr>
+          <w:lang w:val="en-US"/>
+        </w:rPr>
+        <w:br w:type="page"/>
+      </w:r>
+    </w:p>
+    <w:p>
+      <w:pPr>
+        <w:rPr>
+          <w:lang w:val="en-US"/>
+        </w:rPr>
+      </w:pPr>
+      <w:r>
+        <w:rPr>
+          <w:lang w:val="en-US"/>
+        </w:rPr>
+        <w:lastRenderedPageBreak/>
+        <w:t>EVENTS KT</w:t>
+      </w:r>
+    </w:p>
+    <w:p>
+      <w:pPr>
+        <w:pStyle w:val="ListParagraph"/>
+        <w:numPr>
+          <w:ilvl w:val="0"/>
+          <w:numId w:val="5"/>
+        </w:numPr>
+        <w:rPr>
+          <w:lang w:val="en-US"/>
+        </w:rPr>
+      </w:pPr>
+      <w:r>
+        <w:rPr>
+          <w:lang w:val="en-US"/>
+        </w:rPr>
+        <w:t>Period 1: August 31</w:t>
+      </w:r>
+      <w:r>
+        <w:rPr>
+          <w:vertAlign w:val="superscript"/>
+          <w:lang w:val="en-US"/>
+        </w:rPr>
+        <w:t>st</w:t>
+      </w:r>
+      <w:r>
+        <w:rPr>
+          <w:lang w:val="en-US"/>
+        </w:rPr>
+        <w:t xml:space="preserve"> </w:t>
+      </w:r>
+    </w:p>
+    <w:p>
+      <w:pPr>
+        <w:pStyle w:val="ListParagraph"/>
+        <w:numPr>
+          <w:ilvl w:val="1"/>
+          <w:numId w:val="5"/>
+        </w:numPr>
+        <w:rPr>
+          <w:lang w:val="en-US"/>
+        </w:rPr>
+      </w:pPr>
+      <w:r>
+        <w:rPr>
+          <w:lang w:val="en-US"/>
+        </w:rPr>
+        <w:t>Last year, it was an escape room</w:t>
+      </w:r>
+    </w:p>
+    <w:p>
+      <w:pPr>
+        <w:pStyle w:val="ListParagraph"/>
+        <w:numPr>
+          <w:ilvl w:val="1"/>
+          <w:numId w:val="5"/>
+        </w:numPr>
+        <w:rPr>
+          <w:lang w:val="en-US"/>
+        </w:rPr>
+      </w:pPr>
+      <w:r>
+        <w:rPr>
+          <w:lang w:val="en-US"/>
+        </w:rPr>
+        <w:t>Niket’s direction:</w:t>
+      </w:r>
+    </w:p>
+    <w:p>
+      <w:pPr>
+        <w:pStyle w:val="ListParagraph"/>
+        <w:numPr>
+          <w:ilvl w:val="2"/>
+          <w:numId w:val="5"/>
+        </w:numPr>
+        <w:rPr>
+          <w:lang w:val="en-US"/>
+        </w:rPr>
+      </w:pPr>
+      <w:r>
+        <w:rPr>
+          <w:lang w:val="en-US"/>
+        </w:rPr>
+        <w:t>Have fun organizing (priority 1)</w:t>
+      </w:r>
+    </w:p>
+    <w:p>
+      <w:pPr>
+        <w:pStyle w:val="ListParagraph"/>
+        <w:numPr>
+          <w:ilvl w:val="2"/>
+          <w:numId w:val="5"/>
+        </w:numPr>
+        <w:rPr>
+          <w:lang w:val="en-US"/>
+        </w:rPr>
+      </w:pPr>
+      <w:r>
+        <w:rPr>
+          <w:lang w:val="en-US"/>
+        </w:rPr>
+        <w:t xml:space="preserve">Batch should have fun </w:t>
+      </w:r>
+    </w:p>
+    <w:p>
+      <w:pPr>
+        <w:pStyle w:val="ListParagraph"/>
+        <w:numPr>
+          <w:ilvl w:val="1"/>
+          <w:numId w:val="5"/>
+        </w:numPr>
+        <w:rPr>
+          <w:lang w:val="en-US"/>
+        </w:rPr>
+      </w:pPr>
+      <w:r>
+        <w:rPr>
+          <w:lang w:val="en-US"/>
+        </w:rPr>
+        <w:t>Give 3 ideas for the first event</w:t>
+      </w:r>
+    </w:p>
+    <w:p>
+      <w:pPr>
+        <w:pStyle w:val="ListParagraph"/>
+        <w:numPr>
+          <w:ilvl w:val="2"/>
+          <w:numId w:val="5"/>
+        </w:numPr>
+        <w:rPr>
+          <w:lang w:val="en-US"/>
+        </w:rPr>
+      </w:pPr>
+      <w:r>
+        <w:rPr>
+          <w:lang w:val="en-US"/>
+        </w:rPr>
+        <w:t>Escape room</w:t>
+      </w:r>
+    </w:p>
+    <w:p>
+      <w:pPr>
+        <w:pStyle w:val="ListParagraph"/>
+        <w:numPr>
+          <w:ilvl w:val="2"/>
+          <w:numId w:val="5"/>
+        </w:numPr>
+        <w:rPr>
+          <w:lang w:val="en-US"/>
+        </w:rPr>
+      </w:pPr>
+      <w:r>
+        <w:rPr>
+          <w:lang w:val="en-US"/>
+        </w:rPr>
+        <w:t xml:space="preserve"> </w:t>
+      </w:r>
+    </w:p>
+    <w:p>
+      <w:pPr>
+        <w:pStyle w:val="ListParagraph"/>
+        <w:numPr>
+          <w:ilvl w:val="2"/>
+          <w:numId w:val="5"/>
+        </w:numPr>
+        <w:rPr>
+          <w:lang w:val="en-US"/>
+        </w:rPr>
+      </w:pPr>
+      <w:r>
+        <w:rPr>
+          <w:lang w:val="en-US"/>
+        </w:rPr>
+        <w:t xml:space="preserve"> </w:t>
+      </w:r>
+    </w:p>
+    <w:p>
+      <w:pPr>
+        <w:pStyle w:val="ListParagraph"/>
+        <w:numPr>
+          <w:ilvl w:val="2"/>
+          <w:numId w:val="5"/>
+        </w:numPr>
+        <w:rPr>
+          <w:lang w:val="en-US"/>
+        </w:rPr>
+      </w:pPr>
+      <w:r>
+        <w:rPr>
+          <w:lang w:val="en-US"/>
+        </w:rPr>
+        <w:t>Dead-line of giving dead-line for giving event ideas: August 19</w:t>
+      </w:r>
+      <w:r>
+        <w:rPr>
+          <w:vertAlign w:val="superscript"/>
+          <w:lang w:val="en-US"/>
+        </w:rPr>
+        <w:t>t</w:t>
+      </w:r>
+      <w:r>
+        <w:rPr>
+          <w:vertAlign w:val="superscript"/>
+          <w:lang w:val="en-US"/>
+        </w:rPr>
+        <w:t>h</w:t>
+      </w:r>
+    </w:p>
+    <w:p>
+      <w:pPr>
+        <w:pStyle w:val="ListParagraph"/>
+        <w:numPr>
+          <w:ilvl w:val="3"/>
+          <w:numId w:val="5"/>
+        </w:numPr>
+        <w:rPr>
+          <w:lang w:val="en-US"/>
+        </w:rPr>
+      </w:pPr>
+      <w:r>
+        <w:rPr>
+          <w:lang w:val="en-US"/>
+        </w:rPr>
+        <w:t>Try to make the final deadline on August 20th</w:t>
+      </w:r>
+    </w:p>
+    <w:p>
+      <w:pPr>
+        <w:pStyle w:val="ListParagraph"/>
+        <w:numPr>
+          <w:ilvl w:val="1"/>
+          <w:numId w:val="5"/>
+        </w:numPr>
+        <w:rPr>
+          <w:lang w:val="en-US"/>
+        </w:rPr>
+      </w:pPr>
+      <w:r>
+        <w:rPr>
+          <w:lang w:val="en-US"/>
+        </w:rPr>
+        <w:t>Doing simulations instead of quizzes on Unstop in P1</w:t>
+      </w:r>
+    </w:p>
+    <w:p>
+      <w:pPr>
+        <w:pStyle w:val="ListParagraph"/>
+        <w:numPr>
+          <w:ilvl w:val="2"/>
+          <w:numId w:val="5"/>
+        </w:numPr>
+        <w:rPr>
+          <w:lang w:val="en-US"/>
+        </w:rPr>
+      </w:pPr>
+      <w:r>
+        <w:rPr>
+          <w:lang w:val="en-US"/>
+        </w:rPr>
+        <w:t>3 simulations in P1</w:t>
+      </w:r>
+    </w:p>
+    <w:p>
+      <w:pPr>
+        <w:pStyle w:val="ListParagraph"/>
+        <w:numPr>
+          <w:ilvl w:val="2"/>
+          <w:numId w:val="5"/>
+        </w:numPr>
+        <w:rPr>
+          <w:lang w:val="en-US"/>
+        </w:rPr>
+      </w:pPr>
+      <w:r>
+        <w:rPr>
+          <w:lang w:val="en-US"/>
+        </w:rPr>
+        <w:t>Think of 1 every week</w:t>
+      </w:r>
+    </w:p>
+    <w:p>
+      <w:pPr>
+        <w:pStyle w:val="ListParagraph"/>
+        <w:numPr>
+          <w:ilvl w:val="1"/>
+          <w:numId w:val="5"/>
+        </w:numPr>
+        <w:rPr>
+          <w:lang w:val="en-US"/>
+        </w:rPr>
+      </w:pPr>
+      <w:r>
+        <w:rPr>
+          <w:lang w:val="en-US"/>
+        </w:rPr>
+        <w:t>Mock for event to take place 2 days prior with seniors</w:t>
+      </w:r>
+    </w:p>
+    <w:p>
+      <w:pPr>
+        <w:pStyle w:val="ListParagraph"/>
+        <w:numPr>
+          <w:ilvl w:val="0"/>
+          <w:numId w:val="5"/>
+        </w:numPr>
+        <w:rPr>
+          <w:lang w:val="en-US"/>
+        </w:rPr>
+      </w:pPr>
+      <w:r>
+        <w:rPr>
+          <w:lang w:val="en-US"/>
+        </w:rPr>
+        <w:t xml:space="preserve">Period 2: Consultant Of </w:t>
+      </w:r>
+      <w:proofErr w:type="gramStart"/>
+      <w:r>
+        <w:rPr>
+          <w:lang w:val="en-US"/>
+        </w:rPr>
+        <w:t>The</w:t>
+      </w:r>
+      <w:proofErr w:type="gramEnd"/>
+      <w:r>
+        <w:rPr>
+          <w:lang w:val="en-US"/>
+        </w:rPr>
+        <w:t xml:space="preserve"> Year (flagship event)</w:t>
+      </w:r>
+    </w:p>
+    <w:p>
+      <w:pPr>
+        <w:pStyle w:val="ListParagraph"/>
+        <w:numPr>
+          <w:ilvl w:val="1"/>
+          <w:numId w:val="5"/>
+        </w:numPr>
+        <w:rPr>
+          <w:lang w:val="en-US"/>
+        </w:rPr>
+      </w:pPr>
+      <w:r>
+        <w:rPr>
+          <w:lang w:val="en-US"/>
+        </w:rPr>
+        <w:t>New addition</w:t>
+      </w:r>
+    </w:p>
+    <w:p>
+      <w:pPr>
+        <w:pStyle w:val="ListParagraph"/>
+        <w:numPr>
+          <w:ilvl w:val="2"/>
+          <w:numId w:val="5"/>
+        </w:numPr>
+        <w:rPr>
+          <w:lang w:val="en-US"/>
+        </w:rPr>
+      </w:pPr>
+      <w:r>
+        <w:rPr>
+          <w:lang w:val="en-US"/>
+        </w:rPr>
+        <w:t xml:space="preserve">Instead of the second round being unstop quiz, we might exchange it with a simulation </w:t>
+      </w:r>
+    </w:p>
+    <w:p>
+      <w:pPr>
+        <w:pStyle w:val="ListParagraph"/>
+        <w:numPr>
+          <w:ilvl w:val="1"/>
+          <w:numId w:val="5"/>
+        </w:numPr>
+        <w:rPr>
+          <w:lang w:val="en-US"/>
+        </w:rPr>
+      </w:pPr>
+      <w:proofErr w:type="spellStart"/>
+      <w:r>
+        <w:rPr>
+          <w:lang w:val="en-US"/>
+        </w:rPr>
+        <w:t>ConsultantOTY</w:t>
+      </w:r>
+      <w:proofErr w:type="spellEnd"/>
+      <w:r>
+        <w:rPr>
+          <w:lang w:val="en-US"/>
+        </w:rPr>
+        <w:t xml:space="preserve"> has 5-6 rounds</w:t>
+      </w:r>
+    </w:p>
+    <w:p>
+      <w:pPr>
+        <w:pStyle w:val="ListParagraph"/>
+        <w:numPr>
+          <w:ilvl w:val="1"/>
+          <w:numId w:val="5"/>
+        </w:numPr>
+        <w:rPr>
+          <w:lang w:val="en-US"/>
+        </w:rPr>
+      </w:pPr>
+      <w:r>
+        <w:rPr>
+          <w:lang w:val="en-US"/>
+        </w:rPr>
+        <w:t>Legacy of completing OTY first</w:t>
+      </w:r>
+    </w:p>
+    <w:p>
+      <w:pPr>
+        <w:pStyle w:val="ListParagraph"/>
+        <w:numPr>
+          <w:ilvl w:val="1"/>
+          <w:numId w:val="5"/>
+        </w:numPr>
+        <w:rPr>
+          <w:lang w:val="en-US"/>
+        </w:rPr>
+      </w:pPr>
+      <w:r>
+        <w:rPr>
+          <w:lang w:val="en-US"/>
+        </w:rPr>
+        <w:t>Based on response in P1, we will incorporate quizzes and simulations</w:t>
+      </w:r>
+    </w:p>
+    <w:p>
+      <w:pPr>
+        <w:pStyle w:val="ListParagraph"/>
+        <w:numPr>
+          <w:ilvl w:val="0"/>
+          <w:numId w:val="5"/>
+        </w:numPr>
+        <w:rPr>
+          <w:lang w:val="en-US"/>
+        </w:rPr>
+      </w:pPr>
+      <w:r>
+        <w:rPr>
+          <w:lang w:val="en-US"/>
+        </w:rPr>
+        <w:t>Period 3: Consulting Week (+Casebook Launch)</w:t>
+      </w:r>
+    </w:p>
+    <w:p>
+      <w:pPr>
+        <w:pStyle w:val="ListParagraph"/>
+        <w:numPr>
+          <w:ilvl w:val="0"/>
+          <w:numId w:val="5"/>
+        </w:numPr>
+        <w:rPr>
+          <w:lang w:val="en-US"/>
+        </w:rPr>
+      </w:pPr>
+      <w:r>
+        <w:rPr>
+          <w:lang w:val="en-US"/>
+        </w:rPr>
+        <w:t xml:space="preserve">One offline event minimum in each period, seniors want to do more offline events if </w:t>
+      </w:r>
+      <w:proofErr w:type="gramStart"/>
+      <w:r>
+        <w:rPr>
+          <w:lang w:val="en-US"/>
+        </w:rPr>
+        <w:t>possible</w:t>
+      </w:r>
+      <w:proofErr w:type="gramEnd"/>
+      <w:r>
+        <w:rPr>
+          <w:lang w:val="en-US"/>
+        </w:rPr>
+        <w:t xml:space="preserve"> in each period</w:t>
+      </w:r>
+    </w:p>
+    <w:p>
+      <w:pPr>
+        <w:pStyle w:val="ListParagraph"/>
+        <w:numPr>
+          <w:ilvl w:val="0"/>
+          <w:numId w:val="5"/>
+        </w:numPr>
+        <w:rPr>
+          <w:lang w:val="en-US"/>
+        </w:rPr>
+      </w:pPr>
+      <w:r>
+        <w:rPr>
+          <w:lang w:val="en-US"/>
+        </w:rPr>
+        <w:t>We may have to do more offline events to keep the batch engaged</w:t>
+      </w:r>
+    </w:p>
+    <w:p>
+      <w:pPr>
+        <w:pStyle w:val="ListParagraph"/>
+        <w:numPr>
+          <w:ilvl w:val="0"/>
+          <w:numId w:val="5"/>
+        </w:numPr>
+        <w:rPr>
+          <w:lang w:val="en-US"/>
+        </w:rPr>
+      </w:pPr>
+      <w:r>
+        <w:rPr>
+          <w:lang w:val="en-US"/>
+        </w:rPr>
+        <w:t>Mock interviews (not sure what he said about this)</w:t>
+      </w:r>
+    </w:p>
+    <w:p>
+      <w:pPr>
+        <w:pStyle w:val="ListParagraph"/>
+        <w:numPr>
+          <w:ilvl w:val="1"/>
+          <w:numId w:val="5"/>
+        </w:numPr>
+        <w:rPr>
+          <w:lang w:val="en-US"/>
+        </w:rPr>
+      </w:pPr>
+      <w:r>
+        <w:rPr>
+          <w:lang w:val="en-US"/>
+        </w:rPr>
+        <w:t>Best to do when the batch can benefit the most</w:t>
+      </w:r>
+    </w:p>
+    <w:p>
+      <w:pPr>
+        <w:pStyle w:val="ListParagraph"/>
+        <w:numPr>
+          <w:ilvl w:val="0"/>
+          <w:numId w:val="5"/>
+        </w:numPr>
+        <w:rPr>
+          <w:lang w:val="en-US"/>
+        </w:rPr>
+      </w:pPr>
+      <w:r>
+        <w:rPr>
+          <w:lang w:val="en-US"/>
+        </w:rPr>
+        <w:t>Time allocation</w:t>
+      </w:r>
+    </w:p>
+    <w:p>
+      <w:pPr>
+        <w:pStyle w:val="ListParagraph"/>
+        <w:numPr>
+          <w:ilvl w:val="1"/>
+          <w:numId w:val="5"/>
+        </w:numPr>
+        <w:rPr>
+          <w:lang w:val="en-US"/>
+        </w:rPr>
+      </w:pPr>
+      <w:r>
+        <w:rPr>
+          <w:lang w:val="en-US"/>
+        </w:rPr>
+        <w:t>Most amount of time spent on unstop quizzes</w:t>
+      </w:r>
+    </w:p>
+    <w:p>
+      <w:pPr>
+        <w:pStyle w:val="ListParagraph"/>
+        <w:numPr>
+          <w:ilvl w:val="1"/>
+          <w:numId w:val="5"/>
+        </w:numPr>
+        <w:rPr>
+          <w:lang w:val="en-US"/>
+        </w:rPr>
+      </w:pPr>
+      <w:r>
+        <w:rPr>
+          <w:lang w:val="en-US"/>
+        </w:rPr>
+        <w:t>Making simulations (use AI tools)- start with a clear story, questions, and output</w:t>
+      </w:r>
+    </w:p>
+    <w:p>
+      <w:pPr>
+        <w:pStyle w:val="ListParagraph"/>
+        <w:numPr>
+          <w:ilvl w:val="1"/>
+          <w:numId w:val="5"/>
+        </w:numPr>
+        <w:rPr>
+          <w:lang w:val="en-US"/>
+        </w:rPr>
+      </w:pPr>
+      <w:r>
+        <w:rPr>
+          <w:lang w:val="en-US"/>
+        </w:rPr>
+        <w:t>OTY</w:t>
+      </w:r>
+    </w:p>
+    <w:p>
+      <w:pPr>
+        <w:pStyle w:val="ListParagraph"/>
+        <w:numPr>
+          <w:ilvl w:val="2"/>
+          <w:numId w:val="5"/>
+        </w:numPr>
+        <w:rPr>
+          <w:lang w:val="en-US"/>
+        </w:rPr>
+      </w:pPr>
+      <w:r>
+        <w:rPr>
+          <w:lang w:val="en-US"/>
+        </w:rPr>
+        <w:t>Beginning of P2 PR starts for OTY</w:t>
+      </w:r>
+    </w:p>
+    <w:p>
+      <w:pPr>
+        <w:pStyle w:val="ListParagraph"/>
+        <w:numPr>
+          <w:ilvl w:val="2"/>
+          <w:numId w:val="5"/>
+        </w:numPr>
+        <w:rPr>
+          <w:lang w:val="en-US"/>
+        </w:rPr>
+      </w:pPr>
+      <w:r>
+        <w:rPr>
+          <w:lang w:val="en-US"/>
+        </w:rPr>
+        <w:t>The events team will make posters</w:t>
+      </w:r>
+    </w:p>
+    <w:p>
+      <w:pPr>
+        <w:pStyle w:val="ListParagraph"/>
+        <w:numPr>
+          <w:ilvl w:val="2"/>
+          <w:numId w:val="5"/>
+        </w:numPr>
+        <w:rPr>
+          <w:lang w:val="en-US"/>
+        </w:rPr>
+      </w:pPr>
+      <w:r>
+        <w:rPr>
+          <w:lang w:val="en-US"/>
+        </w:rPr>
+        <w:t>Theme for OTY should be finalized by the start of P2</w:t>
+      </w:r>
+    </w:p>
+    <w:p>
+      <w:pPr>
+        <w:pStyle w:val="ListParagraph"/>
+        <w:numPr>
+          <w:ilvl w:val="2"/>
+          <w:numId w:val="5"/>
+        </w:numPr>
+        <w:rPr>
+          <w:lang w:val="en-US"/>
+        </w:rPr>
+      </w:pPr>
+      <w:r>
+        <w:rPr>
+          <w:lang w:val="en-US"/>
+        </w:rPr>
+        <w:t>People working on events spearhead the operations but the entire team needs to be present</w:t>
+      </w:r>
+    </w:p>
+    <w:p>
+      <w:pPr>
+        <w:pStyle w:val="ListParagraph"/>
+        <w:numPr>
+          <w:ilvl w:val="2"/>
+          <w:numId w:val="5"/>
+        </w:numPr>
+        <w:rPr>
+          <w:lang w:val="en-US"/>
+        </w:rPr>
+      </w:pPr>
+      <w:r>
+        <w:rPr>
+          <w:lang w:val="en-US"/>
+        </w:rPr>
+        <w:t>Offline PR</w:t>
+      </w:r>
+    </w:p>
+    <w:p>
+      <w:pPr>
+        <w:pStyle w:val="ListParagraph"/>
+        <w:numPr>
+          <w:ilvl w:val="1"/>
+          <w:numId w:val="5"/>
+        </w:numPr>
+        <w:rPr>
+          <w:lang w:val="en-US"/>
+        </w:rPr>
+      </w:pPr>
+      <w:r>
+        <w:rPr>
+          <w:lang w:val="en-US"/>
+        </w:rPr>
+        <w:lastRenderedPageBreak/>
+        <w:t>Consulting week</w:t>
+      </w:r>
+    </w:p>
+    <w:p>
+      <w:pPr>
+        <w:pStyle w:val="ListParagraph"/>
+        <w:numPr>
+          <w:ilvl w:val="2"/>
+          <w:numId w:val="5"/>
+        </w:numPr>
+        <w:rPr>
+          <w:lang w:val="en-US"/>
+        </w:rPr>
+      </w:pPr>
+      <w:r>
+        <w:rPr>
+          <w:lang w:val="en-US"/>
+        </w:rPr>
+        <w:t xml:space="preserve">Begin reach-outs now itself </w:t>
+      </w:r>
+    </w:p>
+    <w:p>
+      <w:pPr>
+        <w:pStyle w:val="ListParagraph"/>
+        <w:numPr>
+          <w:ilvl w:val="2"/>
+          <w:numId w:val="5"/>
+        </w:numPr>
+        <w:rPr>
+          <w:lang w:val="en-US"/>
+        </w:rPr>
+      </w:pPr>
+      <w:r>
+        <w:rPr>
+          <w:lang w:val="en-US"/>
+        </w:rPr>
+        <w:t>Divide campuses for external outreach</w:t>
+      </w:r>
+    </w:p>
+    <w:p>
+      <w:pPr>
+        <w:pStyle w:val="ListParagraph"/>
+        <w:numPr>
+          <w:ilvl w:val="1"/>
+          <w:numId w:val="5"/>
+        </w:numPr>
+        <w:rPr>
+          <w:lang w:val="en-US"/>
+        </w:rPr>
+      </w:pPr>
+      <w:r>
+        <w:rPr>
+          <w:lang w:val="en-US"/>
+        </w:rPr>
+        <w:t>We only did quizzes for points until now; it’s up to us if we want to experiment with it and add more value</w:t>
+      </w:r>
+    </w:p>
+    <w:p>
+      <w:pPr>
+        <w:pStyle w:val="ListParagraph"/>
+        <w:numPr>
+          <w:ilvl w:val="1"/>
+          <w:numId w:val="5"/>
+        </w:numPr>
+        <w:rPr>
+          <w:lang w:val="en-US"/>
+        </w:rPr>
+      </w:pPr>
+      <w:r>
+        <w:rPr>
+          <w:lang w:val="en-US"/>
+        </w:rPr>
+        <w:t>You can only carry forward 10% of the budget for each period, and the maximum value that can be carried forward is Rs. 500</w:t>
+      </w:r>
+    </w:p>
+    <w:p>
+      <w:pPr>
+        <w:pStyle w:val="ListParagraph"/>
+        <w:numPr>
+          <w:ilvl w:val="1"/>
+          <w:numId w:val="5"/>
+        </w:numPr>
+        <w:rPr>
+          <w:lang w:val="en-US"/>
+        </w:rPr>
+      </w:pPr>
+      <w:r>
+        <w:rPr>
+          <w:lang w:val="en-US"/>
+        </w:rPr>
+        <w:t>Whenever we go to put up posters, Niketh should be with us</w:t>
+      </w:r>
+    </w:p>
+    <w:p>
+      <w:pPr>
+        <w:pStyle w:val="ListParagraph"/>
+        <w:numPr>
+          <w:ilvl w:val="1"/>
+          <w:numId w:val="5"/>
+        </w:numPr>
+        <w:rPr>
+          <w:lang w:val="en-US"/>
+        </w:rPr>
+      </w:pPr>
+      <w:r>
+        <w:rPr>
+          <w:lang w:val="en-US"/>
+        </w:rPr>
+        <w:t xml:space="preserve">Booking the slots is very important </w:t>
+      </w:r>
+    </w:p>
+    <w:p>
+      <w:pPr>
+        <w:pStyle w:val="ListParagraph"/>
+        <w:numPr>
+          <w:ilvl w:val="2"/>
+          <w:numId w:val="5"/>
+        </w:numPr>
+        <w:rPr>
+          <w:lang w:val="en-US"/>
+        </w:rPr>
+      </w:pPr>
+      <w:r>
+        <w:rPr>
+          <w:lang w:val="en-US"/>
+        </w:rPr>
+        <w:t>Do this through the student council portal</w:t>
+      </w:r>
+    </w:p>
+    <w:p>
+      <w:pPr>
+        <w:pStyle w:val="ListParagraph"/>
+        <w:numPr>
+          <w:ilvl w:val="2"/>
+          <w:numId w:val="5"/>
+        </w:numPr>
+        <w:rPr>
+          <w:lang w:val="en-US"/>
+        </w:rPr>
+      </w:pPr>
+      <w:r>
+        <w:rPr>
+          <w:lang w:val="en-US"/>
+        </w:rPr>
+        <w:t>Immediately take a screenshot once the booking is made</w:t>
+      </w:r>
+    </w:p>
+    <w:p>
+      <w:pPr>
+        <w:pStyle w:val="ListParagraph"/>
+        <w:numPr>
+          <w:ilvl w:val="2"/>
+          <w:numId w:val="5"/>
+        </w:numPr>
+        <w:rPr>
+          <w:lang w:val="en-US"/>
+        </w:rPr>
+      </w:pPr>
+      <w:r>
+        <w:rPr>
+          <w:lang w:val="en-US"/>
+        </w:rPr>
+        <w:t>Prefer doing events on days when day-outs are not permitted to increase participation</w:t>
+      </w:r>
+    </w:p>
+    <w:p>
+      <w:pPr>
+        <w:pStyle w:val="ListParagraph"/>
+        <w:numPr>
+          <w:ilvl w:val="2"/>
+          <w:numId w:val="5"/>
+        </w:numPr>
+        <w:rPr>
+          <w:lang w:val="en-US"/>
+        </w:rPr>
+      </w:pPr>
+      <w:r>
+        <w:rPr>
+          <w:lang w:val="en-US"/>
+        </w:rPr>
+        <w:t>People come drunk, don’t be irritated or surprised</w:t>
+      </w:r>
+    </w:p>
+    <w:p>
+      <w:pPr>
+        <w:pStyle w:val="ListParagraph"/>
+        <w:numPr>
+          <w:ilvl w:val="1"/>
+          <w:numId w:val="5"/>
+        </w:numPr>
+        <w:rPr>
+          <w:lang w:val="en-US"/>
+        </w:rPr>
+      </w:pPr>
+      <w:r>
+        <w:rPr>
+          <w:lang w:val="en-US"/>
+        </w:rPr>
+        <w:t>The student council must be given a one-page-long brief before every event</w:t>
+      </w:r>
+    </w:p>
+    <w:p>
+      <w:pPr>
+        <w:pStyle w:val="ListParagraph"/>
+        <w:numPr>
+          <w:ilvl w:val="1"/>
+          <w:numId w:val="5"/>
+        </w:numPr>
+        <w:rPr>
+          <w:lang w:val="en-US"/>
+        </w:rPr>
+      </w:pPr>
+      <w:r>
+        <w:rPr>
+          <w:lang w:val="en-US"/>
+        </w:rPr>
+        <w:t>The treasurer must ensure winners of any event get their prize money within 48 hours. Immediately mail the student council afterward for reimbursement</w:t>
+      </w:r>
+    </w:p>
+    <w:p>
+      <w:pPr>
+        <w:pStyle w:val="ListParagraph"/>
+        <w:numPr>
+          <w:ilvl w:val="1"/>
+          <w:numId w:val="5"/>
+        </w:numPr>
+        <w:rPr>
+          <w:lang w:val="en-US"/>
+        </w:rPr>
+      </w:pPr>
+      <w:r>
+        <w:rPr>
+          <w:lang w:val="en-US"/>
+        </w:rPr>
+        <w:t>Cross-section quizzes (Animesh’s idea)</w:t>
+      </w:r>
+    </w:p>
+    <w:p>
+      <w:pPr>
+        <w:pStyle w:val="ListParagraph"/>
+        <w:numPr>
+          <w:ilvl w:val="1"/>
+          <w:numId w:val="5"/>
+        </w:numPr>
+        <w:rPr>
+          <w:lang w:val="en-US"/>
+        </w:rPr>
+      </w:pPr>
+      <w:r>
+        <w:rPr>
+          <w:lang w:val="en-US"/>
+        </w:rPr>
+        <w:t>Outdoor events require special permission from the Student Council</w:t>
+      </w:r>
+    </w:p>
+    <w:p>
+      <w:pPr>
+        <w:pStyle w:val="ListParagraph"/>
+        <w:numPr>
+          <w:ilvl w:val="1"/>
+          <w:numId w:val="5"/>
+        </w:numPr>
+        <w:rPr>
+          <w:lang w:val="en-US"/>
+        </w:rPr>
+      </w:pPr>
+      <w:r>
+        <w:rPr>
+          <w:lang w:val="en-US"/>
+        </w:rPr>
+        <w:t>Have fun in this vertical</w:t>
+      </w:r>
+    </w:p>
+    <w:p>
+      <w:pPr>
+        <w:pStyle w:val="ListParagraph"/>
+        <w:numPr>
+          <w:ilvl w:val="1"/>
+          <w:numId w:val="5"/>
+        </w:numPr>
+        <w:rPr>
+          <w:lang w:val="en-US"/>
+        </w:rPr>
+      </w:pPr>
+      <w:r>
+        <w:rPr>
+          <w:lang w:val="en-US"/>
+        </w:rPr>
+        <w:t>Keep a timer for when room bookings need to be made for events, and when bookings can be made a week prior</w:t>
+      </w:r>
+    </w:p>
+    <w:p>
+      <w:pPr>
+        <w:pStyle w:val="ListParagraph"/>
+        <w:numPr>
+          <w:ilvl w:val="1"/>
+          <w:numId w:val="5"/>
+        </w:numPr>
+        <w:rPr>
+          <w:lang w:val="en-US"/>
+        </w:rPr>
+      </w:pPr>
+      <w:r>
+        <w:rPr>
+          <w:lang w:val="en-US"/>
+        </w:rPr>
+        <w:t>When booking rooms, book from an hour in advance until two hours after the event</w:t>
+      </w:r>
+    </w:p>
+    <w:p>
+      <w:pPr>
+        <w:pStyle w:val="ListParagraph"/>
+        <w:numPr>
+          <w:ilvl w:val="1"/>
+          <w:numId w:val="5"/>
+        </w:numPr>
+        <w:rPr>
+          <w:lang w:val="en-US"/>
+        </w:rPr>
+      </w:pPr>
+      <w:r>
+        <w:rPr>
+          <w:lang w:val="en-US"/>
+        </w:rPr>
+        <w:t>Prize money for offline events is Rs. 1000</w:t>
+      </w:r>
+    </w:p>
+    <w:p>
+      <w:pPr>
+        <w:pStyle w:val="ListParagraph"/>
+        <w:numPr>
+          <w:ilvl w:val="1"/>
+          <w:numId w:val="5"/>
+        </w:numPr>
+        <w:rPr>
+          <w:lang w:val="en-US"/>
+        </w:rPr>
+      </w:pPr>
+      <w:r>
+        <w:rPr>
+          <w:lang w:val="en-US"/>
+        </w:rPr>
+        <w:t>Once something is decided, try not to change it</w:t>
+      </w:r>
+    </w:p>
+    <w:p>
+      <w:pPr>
+        <w:rPr>
+          <w:lang w:val="en-US"/>
+        </w:rPr>
+      </w:pPr>
+      <w:r>
+        <w:rPr>
+          <w:lang w:val="en-US"/>
+        </w:rPr>
+        <w:br w:type="page"/>
+      </w:r>
+    </w:p>
+    <w:p>
+      <w:pPr>
+        <w:rPr>
+          <w:lang w:val="en-US"/>
+        </w:rPr>
+      </w:pPr>
+      <w:r>
+        <w:rPr>
+          <w:lang w:val="en-US"/>
+        </w:rPr>
+        <w:lastRenderedPageBreak/>
+        <w:t>AI KT</w:t>
+      </w:r>
+    </w:p>
+    <w:p>
+      <w:pPr>
+        <w:pStyle w:val="ListParagraph"/>
+        <w:numPr>
+          <w:ilvl w:val="0"/>
+          <w:numId w:val="6"/>
+        </w:numPr>
+        <w:rPr>
+          <w:lang w:val="en-US"/>
+        </w:rPr>
+      </w:pPr>
+      <w:r>
+        <w:rPr>
+          <w:lang w:val="en-US"/>
+        </w:rPr>
+        <w:t>The idea is to automate and optimize the manual tasks of Wazir</w:t>
+      </w:r>
+    </w:p>
+    <w:p>
+      <w:pPr>
+        <w:pStyle w:val="ListParagraph"/>
+        <w:numPr>
+          <w:ilvl w:val="0"/>
+          <w:numId w:val="6"/>
+        </w:numPr>
+        <w:rPr>
+          <w:lang w:val="en-US"/>
+        </w:rPr>
+      </w:pPr>
+      <w:r>
+        <w:rPr>
+          <w:lang w:val="en-US"/>
+        </w:rPr>
+        <w:t>What must be done to do anything on SI</w:t>
+      </w:r>
+    </w:p>
+    <w:p>
+      <w:pPr>
+        <w:pStyle w:val="ListParagraph"/>
+        <w:numPr>
+          <w:ilvl w:val="1"/>
+          <w:numId w:val="6"/>
+        </w:numPr>
+        <w:rPr>
+          <w:lang w:val="en-US"/>
+        </w:rPr>
+      </w:pPr>
+      <w:r>
+        <w:rPr>
+          <w:lang w:val="en-US"/>
+        </w:rPr>
+        <w:t>IDE (Integrated Development Environment)</w:t>
+      </w:r>
+    </w:p>
+    <w:p>
+      <w:pPr>
+        <w:pStyle w:val="ListParagraph"/>
+        <w:numPr>
+          <w:ilvl w:val="2"/>
+          <w:numId w:val="6"/>
+        </w:numPr>
+        <w:rPr>
+          <w:lang w:val="en-US"/>
+        </w:rPr>
+      </w:pPr>
+      <w:r>
+        <w:rPr>
+          <w:lang w:val="en-US"/>
+        </w:rPr>
+        <w:t>We hire an agent to work on the IDE (because we don’t know how to code)</w:t>
+      </w:r>
+    </w:p>
+    <w:p>
+      <w:pPr>
+        <w:pStyle w:val="ListParagraph"/>
+        <w:numPr>
+          <w:ilvl w:val="2"/>
+          <w:numId w:val="6"/>
+        </w:numPr>
+        <w:rPr>
+          <w:lang w:val="en-US"/>
+        </w:rPr>
+      </w:pPr>
+      <w:r>
+        <w:rPr>
+          <w:lang w:val="en-US"/>
+        </w:rPr>
+        <w:t>The agent that we hire is Antigravity 2.0</w:t>
+      </w:r>
+    </w:p>
+    <w:p>
+      <w:pPr>
+        <w:pStyle w:val="ListParagraph"/>
+        <w:numPr>
+          <w:ilvl w:val="3"/>
+          <w:numId w:val="6"/>
+        </w:numPr>
+        <w:rPr>
+          <w:lang w:val="en-US"/>
+        </w:rPr>
+      </w:pPr>
+      <w:r>
+        <w:rPr>
+          <w:lang w:val="en-US"/>
+        </w:rPr>
+        <w:t>Anything that needs to be done by the IDE, we can ask Antigravity to do</w:t>
+      </w:r>
+    </w:p>
+    <w:p>
+      <w:pPr>
+        <w:pStyle w:val="ListParagraph"/>
+        <w:numPr>
+          <w:ilvl w:val="2"/>
+          <w:numId w:val="6"/>
+        </w:numPr>
+        <w:rPr>
+          <w:lang w:val="en-US"/>
+        </w:rPr>
+      </w:pPr>
+      <w:r>
+        <w:rPr>
+          <w:lang w:val="en-US"/>
+        </w:rPr>
+        <w:t>Antigravity is a sandbox environment</w:t>
+      </w:r>
+    </w:p>
+    <w:p>
+      <w:pPr>
+        <w:pStyle w:val="ListParagraph"/>
+        <w:numPr>
+          <w:ilvl w:val="2"/>
+          <w:numId w:val="6"/>
+        </w:numPr>
+        <w:rPr>
+          <w:lang w:val="en-US"/>
+        </w:rPr>
+      </w:pPr>
+      <w:r>
+        <w:rPr>
+          <w:lang w:val="en-US"/>
+        </w:rPr>
+        <w:t>2 types of limits to be careful about</w:t>
+      </w:r>
+    </w:p>
+    <w:p>
+      <w:pPr>
+        <w:pStyle w:val="ListParagraph"/>
+        <w:numPr>
+          <w:ilvl w:val="3"/>
+          <w:numId w:val="6"/>
+        </w:numPr>
+        <w:rPr>
+          <w:lang w:val="en-US"/>
+        </w:rPr>
+      </w:pPr>
+      <w:r>
+        <w:rPr>
+          <w:lang w:val="en-US"/>
+        </w:rPr>
+        <w:t>Weekly</w:t>
+      </w:r>
+    </w:p>
+    <w:p>
+      <w:pPr>
+        <w:pStyle w:val="ListParagraph"/>
+        <w:numPr>
+          <w:ilvl w:val="3"/>
+          <w:numId w:val="6"/>
+        </w:numPr>
+        <w:rPr>
+          <w:lang w:val="en-US"/>
+        </w:rPr>
+      </w:pPr>
+      <w:r>
+        <w:rPr>
+          <w:lang w:val="en-US"/>
+        </w:rPr>
+        <w:t>5-Hourly</w:t>
+      </w:r>
+    </w:p>
+    <w:p>
+      <w:pPr>
+        <w:pStyle w:val="ListParagraph"/>
+        <w:numPr>
+          <w:ilvl w:val="2"/>
+          <w:numId w:val="6"/>
+        </w:numPr>
+        <w:rPr>
+          <w:lang w:val="en-US"/>
+        </w:rPr>
+      </w:pPr>
+      <w:r>
+        <w:rPr>
+          <w:lang w:val="en-US"/>
+        </w:rPr>
+        <w:t>The number of tokens used depends on the task you’re working on and the number of agents it requires</w:t>
+      </w:r>
+    </w:p>
+    <w:p>
+      <w:pPr>
+        <w:pStyle w:val="ListParagraph"/>
+        <w:numPr>
+          <w:ilvl w:val="1"/>
+          <w:numId w:val="6"/>
+        </w:numPr>
+        <w:rPr>
+          <w:lang w:val="en-US"/>
+        </w:rPr>
+      </w:pPr>
+      <w:r>
+        <w:rPr>
+          <w:lang w:val="en-US"/>
+        </w:rPr>
+        <w:t>Repo</w:t>
+      </w:r>
+    </w:p>
+    <w:p>
+      <w:pPr>
+        <w:pStyle w:val="ListParagraph"/>
+        <w:numPr>
+          <w:ilvl w:val="2"/>
+          <w:numId w:val="6"/>
+        </w:numPr>
+        <w:rPr>
+          <w:lang w:val="en-US"/>
+        </w:rPr>
+      </w:pPr>
+      <w:r>
+        <w:rPr>
+          <w:lang w:val="en-US"/>
+        </w:rPr>
+        <w:t>Storage of all the files</w:t>
+      </w:r>
+    </w:p>
+    <w:p>
+      <w:pPr>
+        <w:pStyle w:val="ListParagraph"/>
+        <w:numPr>
+          <w:ilvl w:val="3"/>
+          <w:numId w:val="6"/>
+        </w:numPr>
+        <w:rPr>
+          <w:lang w:val="en-US"/>
+        </w:rPr>
+      </w:pPr>
+      <w:r>
+        <w:rPr>
+          <w:lang w:val="en-US"/>
+        </w:rPr>
+        <w:t>One type of storage is Git (GitHub)</w:t>
+      </w:r>
+    </w:p>
+    <w:p>
+      <w:pPr>
+        <w:pStyle w:val="ListParagraph"/>
+        <w:numPr>
+          <w:ilvl w:val="2"/>
+          <w:numId w:val="6"/>
+        </w:numPr>
+        <w:rPr>
+          <w:lang w:val="en-US"/>
+        </w:rPr>
+      </w:pPr>
+      <w:r>
+        <w:rPr>
+          <w:lang w:val="en-US"/>
+        </w:rPr>
+        <w:t xml:space="preserve">Whenever IDE hast to connect with Repo it needs </w:t>
+      </w:r>
+    </w:p>
+    <w:p>
+      <w:pPr>
+        <w:pStyle w:val="ListParagraph"/>
+        <w:numPr>
+          <w:ilvl w:val="3"/>
+          <w:numId w:val="6"/>
+        </w:numPr>
+        <w:rPr>
+          <w:lang w:val="en-US"/>
+        </w:rPr>
+      </w:pPr>
+      <w:r>
+        <w:rPr>
+          <w:lang w:val="en-US"/>
+        </w:rPr>
+        <w:t>Repo link</w:t>
+      </w:r>
+    </w:p>
+    <w:p>
+      <w:pPr>
+        <w:pStyle w:val="ListParagraph"/>
+        <w:numPr>
+          <w:ilvl w:val="3"/>
+          <w:numId w:val="6"/>
+        </w:numPr>
+        <w:rPr>
+          <w:lang w:val="en-US"/>
+        </w:rPr>
+      </w:pPr>
+      <w:r>
+        <w:rPr>
+          <w:lang w:val="en-US"/>
+        </w:rPr>
+        <w:t>API key</w:t>
+      </w:r>
+    </w:p>
+    <w:p>
+      <w:pPr>
+        <w:pStyle w:val="ListParagraph"/>
+        <w:numPr>
+          <w:ilvl w:val="1"/>
+          <w:numId w:val="6"/>
+        </w:numPr>
+        <w:rPr>
+          <w:lang w:val="en-US"/>
+        </w:rPr>
+      </w:pPr>
+      <w:r>
+        <w:rPr>
+          <w:lang w:val="en-US"/>
+        </w:rPr>
+        <w:t>Deploy</w:t>
+      </w:r>
+    </w:p>
+    <w:p>
+      <w:pPr>
+        <w:pStyle w:val="ListParagraph"/>
+        <w:numPr>
+          <w:ilvl w:val="1"/>
+          <w:numId w:val="6"/>
+        </w:numPr>
+        <w:rPr>
+          <w:lang w:val="en-US"/>
+        </w:rPr>
+      </w:pPr>
+      <w:r>
+        <w:rPr>
+          <w:lang w:val="en-US"/>
+        </w:rPr>
+        <w:t>Host</w:t>
+      </w:r>
     </w:p>
     <w:sectPr>
       <w:pgSz w:w="11906" w:h="16838"/>
@@ -3154,6 +4609,178 @@
     </w:lvl>
   </w:abstractNum>
   <w:abstractNum w:abstractNumId="1" w15:restartNumberingAfterBreak="0">
+    <w:nsid w:val="22332C2F"/>
+    <w:multiLevelType w:val="hybridMultilevel"/>
+    <w:tmpl w:val="6798B71A"/>
+    <w:lvl w:ilvl="0" w:tplc="0809000F">
+      <w:start w:val="1"/>
+      <w:numFmt w:val="decimal"/>
+      <w:lvlText w:val="%1."/>
+      <w:lvlJc w:val="left"/>
+      <w:pPr>
+        <w:ind w:left="720" w:hanging="360"/>
+      </w:pPr>
+    </w:lvl>
+    <w:lvl w:ilvl="1" w:tplc="08090019">
+      <w:start w:val="1"/>
+      <w:numFmt w:val="lowerLetter"/>
+      <w:lvlText w:val="%2."/>
+      <w:lvlJc w:val="left"/>
+      <w:pPr>
+        <w:ind w:left="1440" w:hanging="360"/>
+      </w:pPr>
+    </w:lvl>
+    <w:lvl w:ilvl="2" w:tplc="0809001B">
+      <w:start w:val="1"/>
+      <w:numFmt w:val="lowerRoman"/>
+      <w:lvlText w:val="%3."/>
+      <w:lvlJc w:val="right"/>
+      <w:pPr>
+        <w:ind w:left="2160" w:hanging="180"/>
+      </w:pPr>
+    </w:lvl>
+    <w:lvl w:ilvl="3" w:tplc="0809000F">
+      <w:start w:val="1"/>
+      <w:numFmt w:val="decimal"/>
+      <w:lvlText w:val="%4."/>
+      <w:lvlJc w:val="left"/>
+      <w:pPr>
+        <w:ind w:left="2880" w:hanging="360"/>
+      </w:pPr>
+    </w:lvl>
+    <w:lvl w:ilvl="4" w:tplc="08090019" w:tentative="1">
+      <w:start w:val="1"/>
+      <w:numFmt w:val="lowerLetter"/>
+      <w:lvlText w:val="%5."/>
+      <w:lvlJc w:val="left"/>
+      <w:pPr>
+        <w:ind w:left="3600" w:hanging="360"/>
+      </w:pPr>
+    </w:lvl>
+    <w:lvl w:ilvl="5" w:tplc="0809001B" w:tentative="1">
+      <w:start w:val="1"/>
+      <w:numFmt w:val="lowerRoman"/>
+      <w:lvlText w:val="%6."/>
+      <w:lvlJc w:val="right"/>
+      <w:pPr>
+        <w:ind w:left="4320" w:hanging="180"/>
+      </w:pPr>
+    </w:lvl>
+    <w:lvl w:ilvl="6" w:tplc="0809000F" w:tentative="1">
+      <w:start w:val="1"/>
+      <w:numFmt w:val="decimal"/>
+      <w:lvlText w:val="%7."/>
+      <w:lvlJc w:val="left"/>
+      <w:pPr>
+        <w:ind w:left="5040" w:hanging="360"/>
+      </w:pPr>
+    </w:lvl>
+    <w:lvl w:ilvl="7" w:tplc="08090019" w:tentative="1">
+      <w:start w:val="1"/>
+      <w:numFmt w:val="lowerLetter"/>
+      <w:lvlText w:val="%8."/>
+      <w:lvlJc w:val="left"/>
+      <w:pPr>
+        <w:ind w:left="5760" w:hanging="360"/>
+      </w:pPr>
+    </w:lvl>
+    <w:lvl w:ilvl="8" w:tplc="0809001B" w:tentative="1">
+      <w:start w:val="1"/>
+      <w:numFmt w:val="lowerRoman"/>
+      <w:lvlText w:val="%9."/>
+      <w:lvlJc w:val="right"/>
+      <w:pPr>
+        <w:ind w:left="6480" w:hanging="180"/>
+      </w:pPr>
+    </w:lvl>
+  </w:abstractNum>
+  <w:abstractNum w:abstractNumId="2" w15:restartNumberingAfterBreak="0">
+    <w:nsid w:val="3ED073A2"/>
+    <w:multiLevelType w:val="hybridMultilevel"/>
+    <w:tmpl w:val="AC3AAEDA"/>
+    <w:lvl w:ilvl="0" w:tplc="0809000F">
+      <w:start w:val="1"/>
+      <w:numFmt w:val="decimal"/>
+      <w:lvlText w:val="%1."/>
+      <w:lvlJc w:val="left"/>
+      <w:pPr>
+        <w:ind w:left="720" w:hanging="360"/>
+      </w:pPr>
+    </w:lvl>
+    <w:lvl w:ilvl="1" w:tplc="08090019">
+      <w:start w:val="1"/>
+      <w:numFmt w:val="lowerLetter"/>
+      <w:lvlText w:val="%2."/>
+      <w:lvlJc w:val="left"/>
+      <w:pPr>
+        <w:ind w:left="1440" w:hanging="360"/>
+      </w:pPr>
+    </w:lvl>
+    <w:lvl w:ilvl="2" w:tplc="0809001B">
+      <w:start w:val="1"/>
+      <w:numFmt w:val="lowerRoman"/>
+      <w:lvlText w:val="%3."/>
+      <w:lvlJc w:val="right"/>
+      <w:pPr>
+        <w:ind w:left="2160" w:hanging="180"/>
+      </w:pPr>
+    </w:lvl>
+    <w:lvl w:ilvl="3" w:tplc="0809000F">
+      <w:start w:val="1"/>
+      <w:numFmt w:val="decimal"/>
+      <w:lvlText w:val="%4."/>
+      <w:lvlJc w:val="left"/>
+      <w:pPr>
+        <w:ind w:left="2880" w:hanging="360"/>
+      </w:pPr>
+    </w:lvl>
+    <w:lvl w:ilvl="4" w:tplc="08090019" w:tentative="1">
+      <w:start w:val="1"/>
+      <w:numFmt w:val="lowerLetter"/>
+      <w:lvlText w:val="%5."/>
+      <w:lvlJc w:val="left"/>
+      <w:pPr>
+        <w:ind w:left="3600" w:hanging="360"/>
+      </w:pPr>
+    </w:lvl>
+    <w:lvl w:ilvl="5" w:tplc="0809001B" w:tentative="1">
+      <w:start w:val="1"/>
+      <w:numFmt w:val="lowerRoman"/>
+      <w:lvlText w:val="%6."/>
+      <w:lvlJc w:val="right"/>
+      <w:pPr>
+        <w:ind w:left="4320" w:hanging="180"/>
+      </w:pPr>
+    </w:lvl>
+    <w:lvl w:ilvl="6" w:tplc="0809000F" w:tentative="1">
+      <w:start w:val="1"/>
+      <w:numFmt w:val="decimal"/>
+      <w:lvlText w:val="%7."/>
+      <w:lvlJc w:val="left"/>
+      <w:pPr>
+        <w:ind w:left="5040" w:hanging="360"/>
+      </w:pPr>
+    </w:lvl>
+    <w:lvl w:ilvl="7" w:tplc="08090019" w:tentative="1">
+      <w:start w:val="1"/>
+      <w:numFmt w:val="lowerLetter"/>
+      <w:lvlText w:val="%8."/>
+      <w:lvlJc w:val="left"/>
+      <w:pPr>
+        <w:ind w:left="5760" w:hanging="360"/>
+      </w:pPr>
+    </w:lvl>
+    <w:lvl w:ilvl="8" w:tplc="0809001B" w:tentative="1">
+      <w:start w:val="1"/>
+      <w:numFmt w:val="lowerRoman"/>
+      <w:lvlText w:val="%9."/>
+      <w:lvlJc w:val="right"/>
+      <w:pPr>
+        <w:ind w:left="6480" w:hanging="180"/>
+      </w:pPr>
+    </w:lvl>
+  </w:abstractNum>
+  <w:abstractNum w:abstractNumId="3" w15:restartNumberingAfterBreak="0">
     <w:nsid w:val="43A54DEA"/>
     <w:multiLevelType w:val="hybridMultilevel"/>
     <w:tmpl w:val="B764F916"/>
@@ -3266,7 +4893,7 @@
       </w:rPr>
     </w:lvl>
   </w:abstractNum>
-  <w:abstractNum w:abstractNumId="2" w15:restartNumberingAfterBreak="0">
+  <w:abstractNum w:abstractNumId="4" w15:restartNumberingAfterBreak="0">
     <w:nsid w:val="53BF2093"/>
     <w:multiLevelType w:val="hybridMultilevel"/>
     <w:tmpl w:val="BD16AE68"/>
@@ -3379,7 +5006,7 @@
       </w:rPr>
     </w:lvl>
   </w:abstractNum>
-  <w:abstractNum w:abstractNumId="3" w15:restartNumberingAfterBreak="0">
+  <w:abstractNum w:abstractNumId="5" w15:restartNumberingAfterBreak="0">
     <w:nsid w:val="6ED64D04"/>
     <w:multiLevelType w:val="hybridMultilevel"/>
     <w:tmpl w:val="982AEF5C"/>
@@ -3496,12 +5123,18 @@
     <w:abstractNumId w:val="0"/>
   </w:num>
   <w:num w:numId="2" w16cid:durableId="198934439">
+    <w:abstractNumId w:val="5"/>
+  </w:num>
+  <w:num w:numId="3" w16cid:durableId="855773580">
+    <w:abstractNumId w:val="4"/>
+  </w:num>
+  <w:num w:numId="4" w16cid:durableId="811749823">
     <w:abstractNumId w:val="3"/>
   </w:num>
-  <w:num w:numId="3" w16cid:durableId="855773580">
+  <w:num w:numId="5" w16cid:durableId="909464015">
     <w:abstractNumId w:val="2"/>
   </w:num>
-  <w:num w:numId="4" w16cid:durableId="811749823">
+  <w:num w:numId="6" w16cid:durableId="54546220">
     <w:abstractNumId w:val="1"/>
   </w:num>
 </w:numbering>

</xml_diff>